<commit_message>
Update CV, CanonCore project page, and gitignore job-search directory
- Add Redux Toolkit, TanStack Query to CanonCore tech list
- Add audio player, four-layer state management, and expanded test/CI details
- Update test count to 3,000+, add Storybook stories and Neon branch details
- Update CV documents
- Gitignore job-search CLI directory
</commit_message>
<xml_diff>
--- a/public/CV.docx
+++ b/public/CV.docx
@@ -270,7 +270,7 @@
       <w:pPr>
         <w:numPr>
           <w:ilvl w:val="0"/>
-          <w:numId w:val="7"/>
+          <w:numId w:val="5"/>
         </w:numPr>
         <w:spacing w:after="0" w:afterAutospacing="0"/>
         <w:ind w:left="720" w:hanging="360"/>
@@ -286,7 +286,7 @@
       <w:pPr>
         <w:numPr>
           <w:ilvl w:val="0"/>
-          <w:numId w:val="7"/>
+          <w:numId w:val="5"/>
         </w:numPr>
         <w:spacing w:after="0" w:afterAutospacing="0" w:before="0" w:beforeAutospacing="0" w:lineRule="auto"/>
         <w:ind w:left="720" w:hanging="360"/>
@@ -306,7 +306,7 @@
       <w:pPr>
         <w:numPr>
           <w:ilvl w:val="0"/>
-          <w:numId w:val="7"/>
+          <w:numId w:val="5"/>
         </w:numPr>
         <w:ind w:left="720" w:hanging="360"/>
       </w:pPr>
@@ -332,7 +332,7 @@
       <w:pPr>
         <w:numPr>
           <w:ilvl w:val="0"/>
-          <w:numId w:val="7"/>
+          <w:numId w:val="5"/>
         </w:numPr>
         <w:ind w:left="720" w:hanging="360"/>
       </w:pPr>
@@ -347,7 +347,7 @@
       <w:pPr>
         <w:numPr>
           <w:ilvl w:val="0"/>
-          <w:numId w:val="7"/>
+          <w:numId w:val="5"/>
         </w:numPr>
         <w:ind w:left="720" w:hanging="360"/>
       </w:pPr>
@@ -503,7 +503,7 @@
           <w:bCs w:val="0"/>
           <w:rtl w:val="0"/>
         </w:rPr>
-        <w:t xml:space="preserve">Developed a WCAG 2.1 AA-compliant component library (75+ components) with multi-brand theming for Pavers, a UK retailer with 160+ stores. Built reusable UI with Storybook documentation using Shopify Liquid and React, enabling content teams to customise pages via Sanity CMS across 5+ brands.</w:t>
+        <w:t xml:space="preserve">Built a WCAG 2.1 AA-compliant component library (75+ components) with multi-brand theming across 5+ brands using React, Shopify Liquid, and Storybook, enabling content teams to customise pages via Sanity CMS.</w:t>
       </w:r>
       <w:r>
         <w:rPr>
@@ -708,7 +708,6 @@
     </w:p>
     <w:p>
       <w:pPr>
-        <w:pStyle w:val="Heading3"/>
         <w:numPr>
           <w:ilvl w:val="0"/>
           <w:numId w:val="6"/>
@@ -718,36 +717,25 @@
         </w:tabs>
         <w:ind w:left="720" w:hanging="360"/>
         <w:rPr>
-          <w:b w:val="0"/>
-          <w:bCs w:val="0"/>
-        </w:rPr>
-      </w:pPr>
-      <w:bookmarkStart w:colFirst="0" w:colLast="0" w:name="_xaexmvoi7hck" w:id="10"/>
-      <w:bookmarkEnd w:id="10"/>
-      <w:r>
-        <w:rPr>
-          <w:b w:val="0"/>
-          <w:bCs w:val="0"/>
-          <w:rtl w:val="0"/>
-        </w:rPr>
-        <w:t xml:space="preserve">Built a full-stack web and React Native iOS media library app, turning your Google Drive files into a Netflix-style interface with TMDB and MediaWiki metadata enrichment, drag-and-drop organisation and progress tracking.</w:t>
-      </w:r>
-      <w:r>
-        <w:rPr>
-          <w:rtl w:val="0"/>
-        </w:rPr>
+          <w:u w:val="none"/>
+        </w:rPr>
+      </w:pPr>
+      <w:r>
+        <w:rPr>
+          <w:rtl w:val="0"/>
+        </w:rPr>
+        <w:t xml:space="preserve">Built a full-stack media library that turns Google Drive into a streaming platform with cinematic UI, TMDB metadata     enrichment, drag-and-drop playlists, and public sharing with forkable collections.</w:t>
       </w:r>
     </w:p>
     <w:p>
       <w:pPr>
         <w:numPr>
           <w:ilvl w:val="0"/>
-          <w:numId w:val="5"/>
+          <w:numId w:val="6"/>
         </w:numPr>
         <w:tabs>
           <w:tab w:val="right" w:leader="none" w:pos="10800"/>
         </w:tabs>
-        <w:spacing w:after="0" w:afterAutospacing="0"/>
         <w:ind w:left="720" w:hanging="360"/>
         <w:rPr>
           <w:u w:val="none"/>
@@ -757,76 +745,120 @@
         <w:rPr>
           <w:rtl w:val="0"/>
         </w:rPr>
-        <w:t xml:space="preserve">Implemented accessible media player with Vidstack supporting streaming, subtitle tracks, and progress persistence.                                                                            </w:t>
+        <w:t xml:space="preserve">Designed a persistent Spotify-style media player with Redux-driven queue management (shuffle, repeat, drag-reorder), backed by a four-layer state architecture separating client, server, URL, and component state.                </w:t>
       </w:r>
     </w:p>
     <w:p>
       <w:pPr>
         <w:numPr>
           <w:ilvl w:val="0"/>
-          <w:numId w:val="5"/>
+          <w:numId w:val="6"/>
         </w:numPr>
         <w:tabs>
           <w:tab w:val="right" w:leader="none" w:pos="10800"/>
         </w:tabs>
-        <w:spacing w:after="0" w:afterAutospacing="0" w:before="0" w:beforeAutospacing="0" w:lineRule="auto"/>
         <w:ind w:left="720" w:hanging="360"/>
         <w:rPr>
-          <w:sz w:val="22"/>
-          <w:szCs w:val="22"/>
-        </w:rPr>
-      </w:pPr>
-      <w:r>
-        <w:rPr>
-          <w:rtl w:val="0"/>
-        </w:rPr>
-        <w:t xml:space="preserve">Developed server-side architecture with Next.js server actions, Prisma ORM, Google Drive OAuth, and Redis rate limiting. Wrote 2,400+ tests across unit, integration, and E2E layers with real Google Drive E2E tests.</w:t>
+          <w:u w:val="none"/>
+        </w:rPr>
+      </w:pPr>
+      <w:r>
+        <w:rPr>
+          <w:rtl w:val="0"/>
+        </w:rPr>
+        <w:t xml:space="preserve">Engineered encrypted Google Drive sync with offline-first queue and batch polling, hardened with account lockout, JWT version invalidation, Redis rate limiting, OWASP headers, and audit logging.                                  </w:t>
       </w:r>
     </w:p>
     <w:p>
       <w:pPr>
         <w:numPr>
           <w:ilvl w:val="0"/>
-          <w:numId w:val="5"/>
+          <w:numId w:val="6"/>
         </w:numPr>
         <w:tabs>
           <w:tab w:val="right" w:leader="none" w:pos="10800"/>
         </w:tabs>
-        <w:spacing w:after="0" w:afterAutospacing="0" w:before="0" w:beforeAutospacing="0" w:lineRule="auto"/>
         <w:ind w:left="720" w:hanging="360"/>
         <w:rPr>
-          <w:sz w:val="22"/>
-          <w:szCs w:val="22"/>
-        </w:rPr>
-      </w:pPr>
-      <w:r>
-        <w:rPr>
-          <w:rtl w:val="0"/>
-        </w:rPr>
-        <w:t xml:space="preserve">Building interactive 3D graph visualisation with Three.js, rendering items and connections as a force-directed node network with camera controls, zoom, and real-time physics.</w:t>
+          <w:u w:val="none"/>
+        </w:rPr>
+      </w:pPr>
+      <w:r>
+        <w:rPr>
+          <w:rtl w:val="0"/>
+        </w:rPr>
+        <w:t xml:space="preserve">3,000+ automated tests (Vitest, Playwright) with 69 Storybook stories and axe-core accessibility checks.</w:t>
       </w:r>
     </w:p>
     <w:p>
       <w:pPr>
         <w:numPr>
           <w:ilvl w:val="0"/>
-          <w:numId w:val="5"/>
+          <w:numId w:val="6"/>
         </w:numPr>
         <w:tabs>
           <w:tab w:val="right" w:leader="none" w:pos="10800"/>
         </w:tabs>
-        <w:spacing w:after="240" w:before="0" w:beforeAutospacing="0" w:lineRule="auto"/>
         <w:ind w:left="720" w:hanging="360"/>
         <w:rPr>
-          <w:sz w:val="22"/>
-          <w:szCs w:val="22"/>
-        </w:rPr>
-      </w:pPr>
-      <w:r>
-        <w:rPr>
-          <w:rtl w:val="0"/>
-        </w:rPr>
-        <w:t xml:space="preserve">Technologies: Next.js, React, React Native, Expo, TypeScript, PostgreSQL, Prisma, Tailwind, Storybook, NextAuth.js, Vitest, Playwright, Redis, Three.js, GitHub Actions</w:t>
+          <w:u w:val="none"/>
+        </w:rPr>
+      </w:pPr>
+      <w:r>
+        <w:rPr>
+          <w:rtl w:val="0"/>
+        </w:rPr>
+        <w:t xml:space="preserve">Building native iOS companion (React Native, Expo) and interactive 3D collection graph (</w:t>
+      </w:r>
+      <w:hyperlink r:id="rId12">
+        <w:r>
+          <w:rPr>
+            <w:color w:val="1155cc"/>
+            <w:u w:val="single"/>
+            <w:rtl w:val="0"/>
+          </w:rPr>
+          <w:t xml:space="preserve">Three.js</w:t>
+        </w:r>
+      </w:hyperlink>
+      <w:r>
+        <w:rPr>
+          <w:rtl w:val="0"/>
+        </w:rPr>
+        <w:t xml:space="preserve">).</w:t>
+      </w:r>
+    </w:p>
+    <w:p>
+      <w:pPr>
+        <w:numPr>
+          <w:ilvl w:val="0"/>
+          <w:numId w:val="6"/>
+        </w:numPr>
+        <w:tabs>
+          <w:tab w:val="right" w:leader="none" w:pos="10800"/>
+        </w:tabs>
+        <w:ind w:left="720" w:hanging="360"/>
+        <w:rPr>
+          <w:u w:val="none"/>
+        </w:rPr>
+      </w:pPr>
+      <w:r>
+        <w:rPr>
+          <w:rtl w:val="0"/>
+        </w:rPr>
+        <w:t xml:space="preserve">Technologies: Next.js 16, React 19, TypeScript, Redux Toolkit, TanStack React Query, PostgreSQL, Prisma 7, Tailwind, Storybook, NextAuth.js, Vitest, Playwright, Upstash Redis, Sentry, Three.js, GitHub Actions</w:t>
+      </w:r>
+    </w:p>
+    <w:p>
+      <w:pPr>
+        <w:tabs>
+          <w:tab w:val="right" w:leader="none" w:pos="10800"/>
+        </w:tabs>
+        <w:rPr/>
+      </w:pPr>
+      <w:r>
+        <w:rPr>
+          <w:rtl w:val="0"/>
+        </w:rPr>
       </w:r>
     </w:p>
     <w:p>
@@ -834,8 +866,8 @@
         <w:pStyle w:val="Heading2"/>
         <w:rPr/>
       </w:pPr>
-      <w:bookmarkStart w:colFirst="0" w:colLast="0" w:name="_yqx4w8owfn8v" w:id="11"/>
-      <w:bookmarkEnd w:id="11"/>
+      <w:bookmarkStart w:colFirst="0" w:colLast="0" w:name="_yqx4w8owfn8v" w:id="10"/>
+      <w:bookmarkEnd w:id="10"/>
       <w:r>
         <w:rPr>
           <w:rtl w:val="0"/>
@@ -851,8 +883,8 @@
         </w:tabs>
         <w:rPr/>
       </w:pPr>
-      <w:bookmarkStart w:colFirst="0" w:colLast="0" w:name="_5mgaesds2xgd" w:id="12"/>
-      <w:bookmarkEnd w:id="12"/>
+      <w:bookmarkStart w:colFirst="0" w:colLast="0" w:name="_5mgaesds2xgd" w:id="11"/>
+      <w:bookmarkEnd w:id="11"/>
       <w:r>
         <w:rPr>
           <w:rtl w:val="0"/>
@@ -1442,116 +1474,6 @@
     </w:lvl>
   </w:abstractNum>
   <w:abstractNum w:abstractNumId="6">
-    <w:lvl w:ilvl="0">
-      <w:start w:val="1"/>
-      <w:numFmt w:val="bullet"/>
-      <w:lvlText w:val="●"/>
-      <w:lvlJc w:val="left"/>
-      <w:pPr>
-        <w:ind w:left="720" w:hanging="360"/>
-      </w:pPr>
-      <w:rPr>
-        <w:u w:val="none"/>
-      </w:rPr>
-    </w:lvl>
-    <w:lvl w:ilvl="1">
-      <w:start w:val="1"/>
-      <w:numFmt w:val="bullet"/>
-      <w:lvlText w:val="○"/>
-      <w:lvlJc w:val="left"/>
-      <w:pPr>
-        <w:ind w:left="1440" w:hanging="360"/>
-      </w:pPr>
-      <w:rPr>
-        <w:u w:val="none"/>
-      </w:rPr>
-    </w:lvl>
-    <w:lvl w:ilvl="2">
-      <w:start w:val="1"/>
-      <w:numFmt w:val="bullet"/>
-      <w:lvlText w:val="■"/>
-      <w:lvlJc w:val="left"/>
-      <w:pPr>
-        <w:ind w:left="2160" w:hanging="360"/>
-      </w:pPr>
-      <w:rPr>
-        <w:u w:val="none"/>
-      </w:rPr>
-    </w:lvl>
-    <w:lvl w:ilvl="3">
-      <w:start w:val="1"/>
-      <w:numFmt w:val="bullet"/>
-      <w:lvlText w:val="●"/>
-      <w:lvlJc w:val="left"/>
-      <w:pPr>
-        <w:ind w:left="2880" w:hanging="360"/>
-      </w:pPr>
-      <w:rPr>
-        <w:u w:val="none"/>
-      </w:rPr>
-    </w:lvl>
-    <w:lvl w:ilvl="4">
-      <w:start w:val="1"/>
-      <w:numFmt w:val="bullet"/>
-      <w:lvlText w:val="○"/>
-      <w:lvlJc w:val="left"/>
-      <w:pPr>
-        <w:ind w:left="3600" w:hanging="360"/>
-      </w:pPr>
-      <w:rPr>
-        <w:u w:val="none"/>
-      </w:rPr>
-    </w:lvl>
-    <w:lvl w:ilvl="5">
-      <w:start w:val="1"/>
-      <w:numFmt w:val="bullet"/>
-      <w:lvlText w:val="■"/>
-      <w:lvlJc w:val="left"/>
-      <w:pPr>
-        <w:ind w:left="4320" w:hanging="360"/>
-      </w:pPr>
-      <w:rPr>
-        <w:u w:val="none"/>
-      </w:rPr>
-    </w:lvl>
-    <w:lvl w:ilvl="6">
-      <w:start w:val="1"/>
-      <w:numFmt w:val="bullet"/>
-      <w:lvlText w:val="●"/>
-      <w:lvlJc w:val="left"/>
-      <w:pPr>
-        <w:ind w:left="5040" w:hanging="360"/>
-      </w:pPr>
-      <w:rPr>
-        <w:u w:val="none"/>
-      </w:rPr>
-    </w:lvl>
-    <w:lvl w:ilvl="7">
-      <w:start w:val="1"/>
-      <w:numFmt w:val="bullet"/>
-      <w:lvlText w:val="○"/>
-      <w:lvlJc w:val="left"/>
-      <w:pPr>
-        <w:ind w:left="5760" w:hanging="360"/>
-      </w:pPr>
-      <w:rPr>
-        <w:u w:val="none"/>
-      </w:rPr>
-    </w:lvl>
-    <w:lvl w:ilvl="8">
-      <w:start w:val="1"/>
-      <w:numFmt w:val="bullet"/>
-      <w:lvlText w:val="■"/>
-      <w:lvlJc w:val="left"/>
-      <w:pPr>
-        <w:ind w:left="6480" w:hanging="360"/>
-      </w:pPr>
-      <w:rPr>
-        <w:u w:val="none"/>
-      </w:rPr>
-    </w:lvl>
-  </w:abstractNum>
-  <w:abstractNum w:abstractNumId="7">
     <w:lvl w:ilvl="0">
       <w:start w:val="1"/>
       <w:numFmt w:val="bullet"/>
@@ -1678,9 +1600,6 @@
   </w:num>
   <w:num w:numId="6">
     <w:abstractNumId w:val="6"/>
-  </w:num>
-  <w:num w:numId="7">
-    <w:abstractNumId w:val="7"/>
   </w:num>
 </w:numbering>
 </file>

</xml_diff>